<commit_message>
Align manuscript workflow with ICPA PDF
</commit_message>
<xml_diff>
--- a/paper/word/icpa_manuscript_draft.docx
+++ b/paper/word/icpa_manuscript_draft.docx
@@ -568,6 +568,25 @@
         <w:t>Use author-year references following the ICPA/Precision Agriculture guidance. Include only cited and verified published or accepted works.</w:t>
       </w:r>
     </w:p>
+    <w:p>
+      <w:pPr>
+        <w:ind w:left="288" w:right="288"/>
+      </w:pPr>
+      <w:r>
+        <w:rPr>
+          <w:b/>
+          <w:color w:val="1F4E79"/>
+          <w:sz w:val="20"/>
+        </w:rPr>
+        <w:t xml:space="preserve">ICPA format checkpoint: </w:t>
+      </w:r>
+      <w:r>
+        <w:rPr>
+          <w:sz w:val="20"/>
+        </w:rPr>
+        <w:t>The 2026 full-paper instruction PDF requires Microsoft Word, camera-ready inline figures and tables, a maximum of 15 pages including references, and a conservative manuscript deadline of 22 May 2026.</w:t>
+      </w:r>
+    </w:p>
     <w:sectPr>
       <w:pgSz w:w="12240" w:h="15840"/>
       <w:pgMar w:top="1224" w:right="1080" w:bottom="1224" w:left="1080" w:header="720" w:footer="720" w:gutter="0"/>

</xml_diff>

<commit_message>
Sharpen paper USP against near priors
</commit_message>
<xml_diff>
--- a/paper/word/icpa_manuscript_draft.docx
+++ b/paper/word/icpa_manuscript_draft.docx
@@ -64,7 +64,12 @@
     </w:p>
     <w:p>
       <w:r>
-        <w:t>This section should motivate why cotton boll analysis must move beyond 2D counting. It should introduce defoliation as a visibility intervention, explain why textureless cotton lint challenges classical reconstruction, and state the exact contributions: detection-guided 3D localization, morphology estimation, pre/post evaluation, and robustness analysis.</w:t>
+        <w:t>This section should motivate why cotton boll analysis must move beyond 2D counting while also avoiding overclaims. Prior UAV cotton reconstruction and Cotton3DGaussians already show that cotton bolls can be reconstructed in 3D under suitable capture conditions. The introduction should therefore frame this paper around a narrower and stronger gap: paired pre- and post-defoliation UAV imagery, visibility-conditioned boll morphology, and detection-guided semantic association under field-scale occlusion.</w:t>
+      </w:r>
+    </w:p>
+    <w:p>
+      <w:r>
+        <w:t>Proposed contribution wording: (i) a paired pre/post-defoliation UAV protocol for visibility-aware cotton boll phenotyping; (ii) detection-guided semantic multi-view association that reduces dense annotation; (iii) high-confidence boll morphology estimates including 3D center, diameter or length proxy, volume proxy, visibility, and occlusion; (iv) a field-scale reconstruction viewer with semantic boll anchors; and (v) an evaluated MoE/LLM reporting layer that converts measured morphology into structured agronomic recommendations without computing the geometry.</w:t>
       </w:r>
     </w:p>
     <w:p>
@@ -101,6 +106,68 @@
     </w:p>
     <w:p>
       <w:pPr>
+        <w:spacing w:before="60" w:after="180"/>
+      </w:pPr>
+      <w:r>
+        <w:rPr>
+          <w:b/>
+        </w:rPr>
+        <w:t>Table 1</w:t>
+      </w:r>
+      <w:r>
+        <w:t xml:space="preserve"> Closest-prior contrast. The final manuscript should cite the two near papers directly and avoid claiming novelty from generic 3D reconstruction alone.</w:t>
+      </w:r>
+    </w:p>
+    <w:p>
+      <w:pPr>
+        <w:ind w:left="288"/>
+      </w:pPr>
+      <w:r>
+        <w:rPr>
+          <w:b/>
+          <w:sz w:val="18"/>
+        </w:rPr>
+        <w:t>Columns: Work | Capture | 3D method | Boll traits | Gap left for this paper</w:t>
+      </w:r>
+    </w:p>
+    <w:p>
+      <w:pPr>
+        <w:spacing w:after="20"/>
+        <w:ind w:left="504"/>
+      </w:pPr>
+      <w:r>
+        <w:rPr>
+          <w:sz w:val="18"/>
+        </w:rPr>
+        <w:t>UAV cotton 3D reconstruction | UAV CCO/nadir | Photogrammetric point cloud | Count, volume, yield relation | No paired pre/post visibility intervention or semantic association focus</w:t>
+      </w:r>
+    </w:p>
+    <w:p>
+      <w:pPr>
+        <w:spacing w:after="20"/>
+        <w:ind w:left="504"/>
+      </w:pPr>
+      <w:r>
+        <w:rPr>
+          <w:sz w:val="18"/>
+        </w:rPr>
+        <w:t>Cotton3DGaussians | Single-plant 360 smartphone | 3D Gaussian Splatting + mask projection | Count, volume, plant architecture | Not field-scale paired UAV defoliation; no MoE reporting evaluation</w:t>
+      </w:r>
+    </w:p>
+    <w:p>
+      <w:pPr>
+        <w:spacing w:after="20"/>
+        <w:ind w:left="504"/>
+      </w:pPr>
+      <w:r>
+        <w:rPr>
+          <w:sz w:val="18"/>
+        </w:rPr>
+        <w:t>This work | Paired pre/post UAV | Detection-guided geometry/3DGS + semantic association | Count, center, diameter/length proxy, volume proxy, visibility | Visibility-aware field-scale morphology under defoliation</w:t>
+      </w:r>
+    </w:p>
+    <w:p>
+      <w:pPr>
         <w:pStyle w:val="Heading1"/>
       </w:pPr>
       <w:r>
@@ -109,7 +176,7 @@
     </w:p>
     <w:p>
       <w:r>
-        <w:t>The method section should be modular: dataset audit, 2D detector prior, mask refinement, camera geometry, DINOv2 correspondence, multi-view association, 3D localization, and morphology extraction. The LLM/reporting component should remain optional and downstream.</w:t>
+        <w:t>The method section should be modular: dataset audit, 2D detector prior, mask refinement, camera geometry or 3D Gaussian Splatting, DINOv2 correspondence, multi-view association, 3D localization, and morphology extraction. The LLM/reporting component should remain optional and downstream.</w:t>
       </w:r>
     </w:p>
     <w:p>
@@ -120,7 +187,7 @@
         <w:rPr>
           <w:b/>
         </w:rPr>
-        <w:t>Table 1</w:t>
+        <w:t>Table 2</w:t>
       </w:r>
       <w:r>
         <w:t xml:space="preserve"> Architecture modules and expected outputs. This table should stay early in the method section to keep the system readable.</w:t>
@@ -195,6 +262,18 @@
         <w:rPr>
           <w:sz w:val="18"/>
         </w:rPr>
+        <w:t>3DGS/viewer | Poses and images | Gaussian/point scene | Visualize and compare reconstruction quality</w:t>
+      </w:r>
+    </w:p>
+    <w:p>
+      <w:pPr>
+        <w:spacing w:after="20"/>
+        <w:ind w:left="504"/>
+      </w:pPr>
+      <w:r>
+        <w:rPr>
+          <w:sz w:val="18"/>
+        </w:rPr>
         <w:t>Association | Detections, poses, features | Boll tracks | Link same boll across views</w:t>
       </w:r>
     </w:p>
@@ -207,7 +286,38 @@
         <w:rPr>
           <w:sz w:val="18"/>
         </w:rPr>
-        <w:t>Morphology | 3D tracks | Diameter, volume, visibility | Deliver phenotyping measurements</w:t>
+        <w:t>Morphology | 3D tracks | Diameter/length, volume, visibility | Deliver high-confidence phenotyping measurements</w:t>
+      </w:r>
+    </w:p>
+    <w:p>
+      <w:pPr>
+        <w:spacing w:after="20"/>
+        <w:ind w:left="504"/>
+      </w:pPr>
+      <w:r>
+        <w:rPr>
+          <w:sz w:val="18"/>
+        </w:rPr>
+        <w:t>MoE reporting | Morphology JSON | Structured report | Evaluate decision support without changing geometry</w:t>
+      </w:r>
+    </w:p>
+    <w:p>
+      <w:pPr>
+        <w:ind w:left="288" w:right="288"/>
+      </w:pPr>
+      <w:r>
+        <w:rPr>
+          <w:b/>
+          <w:color w:val="1F4E79"/>
+          <w:sz w:val="20"/>
+        </w:rPr>
+        <w:t xml:space="preserve">Measurement boundary: </w:t>
+      </w:r>
+      <w:r>
+        <w:rPr>
+          <w:sz w:val="20"/>
+        </w:rPr>
+        <w:t>Report diameter, length, and volume only for high-confidence bolls with sufficient view support, scale calibration, and mask consistency. Whole-field morphology should include coverage and uncertainty.</w:t>
       </w:r>
     </w:p>
     <w:p>
@@ -231,7 +341,7 @@
         <w:rPr>
           <w:b/>
         </w:rPr>
-        <w:t>Table 2</w:t>
+        <w:t>Table 3</w:t>
       </w:r>
       <w:r>
         <w:t xml:space="preserve"> Main reconstruction and boll recovery comparison. Replace TBD values only with measured results.</w:t>
@@ -317,7 +427,7 @@
         <w:rPr>
           <w:b/>
         </w:rPr>
-        <w:t>Table 3</w:t>
+        <w:t>Table 4</w:t>
       </w:r>
       <w:r>
         <w:t xml:space="preserve"> Robustness grid for detection-guided 3D boll phenotyping.</w:t>
@@ -439,7 +549,7 @@
         <w:rPr>
           <w:b/>
         </w:rPr>
-        <w:t>Table 4</w:t>
+        <w:t>Table 5</w:t>
       </w:r>
       <w:r>
         <w:t xml:space="preserve"> Pre- and post-defoliation morphology statistics.</w:t>
@@ -454,7 +564,7 @@
           <w:b/>
           <w:sz w:val="18"/>
         </w:rPr>
-        <w:t>Columns: Trait | Pre mean +/- SD | Post mean +/- SD | Delta | Effect | p</w:t>
+        <w:t>Columns: Trait | Pre mean +/- SD | Post mean +/- SD | Delta | Coverage | p</w:t>
       </w:r>
     </w:p>
     <w:p>
@@ -502,6 +612,18 @@
         <w:rPr>
           <w:sz w:val="18"/>
         </w:rPr>
+        <w:t>Length (mm) | TBD | TBD | TBD | TBD | TBD</w:t>
+      </w:r>
+    </w:p>
+    <w:p>
+      <w:pPr>
+        <w:spacing w:after="20"/>
+        <w:ind w:left="504"/>
+      </w:pPr>
+      <w:r>
+        <w:rPr>
+          <w:sz w:val="18"/>
+        </w:rPr>
         <w:t>Volume (mm3) | TBD | TBD | TBD | TBD | TBD</w:t>
       </w:r>
     </w:p>
@@ -531,6 +653,92 @@
     </w:p>
     <w:p>
       <w:pPr>
+        <w:spacing w:before="60" w:after="180"/>
+      </w:pPr>
+      <w:r>
+        <w:rPr>
+          <w:b/>
+        </w:rPr>
+        <w:t>Table 6</w:t>
+      </w:r>
+      <w:r>
+        <w:t xml:space="preserve"> MoE/LLM agronomic reporting ablation. The LLM receives only measured morphology JSON and is evaluated separately from geometry.</w:t>
+      </w:r>
+    </w:p>
+    <w:p>
+      <w:pPr>
+        <w:ind w:left="288"/>
+      </w:pPr>
+      <w:r>
+        <w:rPr>
+          <w:b/>
+          <w:sz w:val="18"/>
+        </w:rPr>
+        <w:t>Columns: Model family | Model | Schema | Faithful | Unsupported | Latency</w:t>
+      </w:r>
+    </w:p>
+    <w:p>
+      <w:pPr>
+        <w:spacing w:after="20"/>
+        <w:ind w:left="504"/>
+      </w:pPr>
+      <w:r>
+        <w:rPr>
+          <w:sz w:val="18"/>
+        </w:rPr>
+        <w:t>Dense reasoning | Qwen3-32B | TBD | TBD | TBD | TBD</w:t>
+      </w:r>
+    </w:p>
+    <w:p>
+      <w:pPr>
+        <w:spacing w:after="20"/>
+        <w:ind w:left="504"/>
+      </w:pPr>
+      <w:r>
+        <w:rPr>
+          <w:sz w:val="18"/>
+        </w:rPr>
+        <w:t>MoE reasoning | Qwen3-30B-A3B | TBD | TBD | TBD | TBD</w:t>
+      </w:r>
+    </w:p>
+    <w:p>
+      <w:pPr>
+        <w:spacing w:after="20"/>
+        <w:ind w:left="504"/>
+      </w:pPr>
+      <w:r>
+        <w:rPr>
+          <w:sz w:val="18"/>
+        </w:rPr>
+        <w:t>Classic MoE | Mixtral/DeepSeek MoE | TBD | TBD | TBD | TBD</w:t>
+      </w:r>
+    </w:p>
+    <w:p>
+      <w:pPr>
+        <w:spacing w:after="20"/>
+        <w:ind w:left="504"/>
+      </w:pPr>
+      <w:r>
+        <w:rPr>
+          <w:sz w:val="18"/>
+        </w:rPr>
+        <w:t>Agriculture | AgriLLaMA-7B | TBD | TBD | TBD | TBD</w:t>
+      </w:r>
+    </w:p>
+    <w:p>
+      <w:pPr>
+        <w:spacing w:after="20"/>
+        <w:ind w:left="504"/>
+      </w:pPr>
+      <w:r>
+        <w:rPr>
+          <w:sz w:val="18"/>
+        </w:rPr>
+        <w:t>Multimodal | Gemma/Mistral/InternVL | TBD | TBD | TBD | TBD</w:t>
+      </w:r>
+    </w:p>
+    <w:p>
+      <w:pPr>
         <w:pStyle w:val="Heading1"/>
       </w:pPr>
       <w:r>
@@ -540,6 +748,11 @@
     <w:p>
       <w:r>
         <w:t>Discuss what was reliable, what failed, and what must be treated as high-confidence subset morphology rather than whole-field perfect reconstruction. This is where duplicate frames, wind, weak baselines, scale uncertainty, and repeated white lint texture should be handled frankly.</w:t>
+      </w:r>
+    </w:p>
+    <w:p>
+      <w:r>
+        <w:t>The discussion should explicitly state how the work differs from the two closest references: the UAV CCO paper establishes field-scale 3D cotton boll point-cloud phenotyping, and Cotton3DGaussians establishes single-plant 3DGS with mask projection. The present work should be defended through the paired defoliation protocol, visibility-conditioned morphology, semantic association, and evaluated MoE reporting loop.</w:t>
       </w:r>
     </w:p>
     <w:p>

</xml_diff>